<commit_message>
Add copywriter partnerships at imre and STARZ to Kettle CV
Co-Authored-By: Claude Opus 5.5 <noreply@anthropic.com>
Claude-Session: https://claude.ai/code/session_01GqW8cM2soKKzQ2aNFApto7
</commit_message>
<xml_diff>
--- a/Michael_Chuang_CV_Kettle_ACD_Design.docx
+++ b/Michael_Chuang_CV_Kettle_ACD_Design.docx
@@ -50,7 +50,7 @@
     </w:p>
     <w:p>
       <w:r>
-        <w:t>Design-led creative leader and hands-on maker with 15+ years across agency, in-house, and studio work, and 7 years managing a design and development team. Leads campaigns from big idea through execution across digital, social, web, email, and video for brands including Netflix, STARZ, AstraZeneca, GSK, and WOW! Internet. Adapts look and feel across industries and audiences, from entertainment and consumer telecom to regulated pharmaceutical brands, and ties every idea back to business goals. Designs for motion as well as static work, with hands-on After Effects and Premiere skills. Gives clear, actionable direction, holds a high bar for craft, and mentors designers to grow. Builds persuasive pitch decks and presentations that win over clients and executives. Actively uses AI in the creative workflow (Midjourney, Adobe Firefly, Claude) to explore ideas and speed up production.</w:t>
+        <w:t>Design-led creative leader and hands-on maker with 15+ years across agency, in-house, and studio work, and 7 years managing a design and development team. Leads campaigns from big idea through execution across digital, social, web, email, and video for brands including Netflix, STARZ, AstraZeneca, GSK, and WOW! Internet. Adapts look and feel across industries and audiences, from entertainment and consumer telecom to regulated pharmaceutical brands, and ties every idea back to business goals. Designs for motion as well as static work, with hands-on After Effects and Premiere skills. Believes design and copy are strongest built together, with a long track record of concepting side by side with copywriters. Gives clear, actionable direction, holds a high bar for craft, and mentors designers to grow. Builds persuasive pitch decks and presentations that win over clients and executives. Actively uses AI in the creative workflow (Midjourney, Adobe Firefly, Claude) to explore ideas and speed up production.</w:t>
       </w:r>
     </w:p>
     <w:p>
@@ -79,7 +79,7 @@
         <w:t>Creative Leadership:</w:t>
       </w:r>
       <w:r>
-        <w:t xml:space="preserve"> Campaign concepting &amp; big ideas · Clear, actionable direction · Mentoring designers · Performance reviews &amp; hiring</w:t>
+        <w:t xml:space="preserve"> Campaign concepting &amp; big ideas · Clear, actionable direction · Concepting with copywriters · Mentoring designers · Performance reviews &amp; hiring</w:t>
       </w:r>
     </w:p>
     <w:p>
@@ -353,6 +353,14 @@
         <w:pStyle w:val="ListBullet"/>
       </w:pPr>
       <w:r>
+        <w:t>Frequently partnered with a copywriter on ideation and messaging, so design and copy were developed together from the first concept.</w:t>
+      </w:r>
+    </w:p>
+    <w:p>
+      <w:pPr>
+        <w:pStyle w:val="ListBullet"/>
+      </w:pPr>
+      <w:r>
         <w:t>Designed executive presentations and pitch decks in PowerPoint and Google Slides, and built templates, style guides, and brand toolkits that streamlined approvals.</w:t>
       </w:r>
     </w:p>
@@ -404,6 +412,14 @@
       </w:pPr>
       <w:r>
         <w:t>Led creative for Digital Marketing, Originals Marketing, PR, and International teams, managing feedback from many stakeholders and setting clear deadlines and expectations for the team.</w:t>
+      </w:r>
+    </w:p>
+    <w:p>
+      <w:pPr>
+        <w:pStyle w:val="ListBullet"/>
+      </w:pPr>
+      <w:r>
+        <w:t>Worked closely with the Senior Copywriter on every project and concepting session, building ideas where the visuals and the words worked as one.</w:t>
       </w:r>
     </w:p>
     <w:p>

</xml_diff>